<commit_message>
Fix proposal and README to match actual implementation status
</commit_message>
<xml_diff>
--- a/docs/JIT_Access_Manager_Proposal.docx
+++ b/docs/JIT_Access_Manager_Proposal.docx
@@ -250,7 +250,7 @@
           <w:sz w:val="22"/>
           <w:szCs w:val="22"/>
         </w:rPr>
-        <w:t xml:space="preserve">The application is a small internal access-request service. An employee signs in and submits a request describing the permission needed and how long it is needed for. A designated approver receives a notification and approves or denies the request from a simple authenticated endpoint. On approval, the system attaches a scoped IAM policy to the requester's role and, in the same action, schedules its own automatic revocation for the requested expiry time — the revocation is never a separate manual step that could be forgotten. When the scheduled time arrives, the system removes the granted policy without any human involvement and records the outcome. Every stage of this lifecycle — request, approval, grant, revocation, and any failure along the way — is written to a durable audit log and is independently visible in the AWS account's own API activity log, so the two records can be cross-checked against each other.</w:t>
+        <w:t xml:space="preserve">The application is a small internal access-request service, with both an API and a lightweight browser dashboard for employees and managers. An employee signs in and submits a request describing the permission needed and how long it is needed for. A designated approver receives a notification and approves or denies the request from an authenticated dashboard or endpoint. On approval, the system attaches a scoped IAM policy to the requester's role and, in the same action, schedules its own automatic revocation for the requested expiry time — the revocation is never a separate manual step that could be forgotten. When the scheduled time arrives, the system removes the granted policy without any human involvement and records the outcome. Every stage of this lifecycle — request, approval, grant, revocation, and any failure along the way — is written to a durable audit log.</w:t>
       </w:r>
     </w:p>
     <w:p>
@@ -382,7 +382,7 @@
           <w:sz w:val="22"/>
           <w:szCs w:val="22"/>
         </w:rPr>
-        <w:t xml:space="preserve">Runs three functions — request_access, approve_access, and revoke_access — each triggered only when needed, with no persistently running server.</w:t>
+        <w:t xml:space="preserve">Runs four functions — request_access, approve_access, revoke_access, and list_requests — each triggered only when needed, with no persistently running server.</w:t>
       </w:r>
     </w:p>
     <w:p>
@@ -586,7 +586,7 @@
           <w:sz w:val="22"/>
           <w:szCs w:val="22"/>
         </w:rPr>
-        <w:t xml:space="preserve">Collects logs and metrics from all three Lambda functions and alarms on errors, particularly any failure in the revocation path.</w:t>
+        <w:t xml:space="preserve">Collects logs and metrics from all four Lambda functions and alarms on errors, particularly any failure in the revocation path.</w:t>
       </w:r>
     </w:p>
     <w:p>
@@ -935,7 +935,7 @@
           <w:sz w:val="22"/>
           <w:szCs w:val="22"/>
         </w:rPr>
-        <w:t xml:space="preserve">The plan is to automate the creation of the Cognito user pool, the DynamoDB table, all three Lambda functions with their IAM roles, and the API Gateway routes, so the entire environment can be torn down and rebuilt consistently from the template instead of depending on manual steps that are easy to get wrong the second time around.</w:t>
+        <w:t xml:space="preserve">The plan is to automate the creation of the Cognito user pool, the DynamoDB table, all four Lambda functions with their IAM roles, and the API Gateway routes, so the entire environment can be torn down and rebuilt consistently from the template instead of depending on manual steps that are easy to get wrong the second time around.</w:t>
       </w:r>
     </w:p>
     <w:p>
@@ -965,7 +965,7 @@
           <w:sz w:val="22"/>
           <w:szCs w:val="22"/>
         </w:rPr>
-        <w:t xml:space="preserve">Access control is the subject of this project as much as its implementation detail: every IAM policy the system attaches is scoped to exactly the permission and resource named in the request, never a broad role, and every attachment has an expiry scheduled before the grant is even returned to the requester. Each of the three Lambda functions runs under its own narrowly scoped role — for example, only approve_access can attach IAM policies, and only revoke_access can detach them.</w:t>
+        <w:t xml:space="preserve">Access control is the subject of this project as much as its implementation detail: every IAM policy the system attaches is scoped to exactly the permission and resource named in the request, never a broad role, and every attachment has an expiry scheduled before the grant is even returned to the requester. Each of the four Lambda functions runs under its own narrowly scoped role — for example, only approve_access can attach IAM policies, and only revoke_access can detach them.</w:t>
       </w:r>
     </w:p>
     <w:p>
@@ -979,7 +979,21 @@
           <w:sz w:val="22"/>
           <w:szCs w:val="22"/>
         </w:rPr>
-        <w:t xml:space="preserve">Monitoring and logging are handled by CloudWatch, which alarms on any Lambda error, with particular attention to a failure in the revocation path, since a revocation that silently fails is the single most dangerous failure mode this system has. CloudTrail independently records every IAM policy attachment and detachment the system makes, which is deliberately kept separate from the application's own DynamoDB audit log so that the two can be cross-checked against each other rather than relying on a single source of truth. Amazon SNS delivers alerts for genuine issues — a new request awaiting approval, or a revocation that failed to complete — rather than routine activity.</w:t>
+        <w:t xml:space="preserve">Monitoring and logging are handled by CloudWatch, which alarms on any Lambda error, with particular attention to a failure in the revocation path, since a revocation that silently fails is the single most dangerous failure mode this system has. CloudTrail is designed to independently record every IAM policy attachment and detachment the system makes, deliberately kept separate from the application's own DynamoDB audit log so that the two can eventually be cross-checked against each other rather than relying on a single source of truth. Amazon SNS delivers alerts for genuine issues — a new request awaiting approval, or a revocation that failed to complete — rather than routine activity.</w:t>
+      </w:r>
+    </w:p>
+    <w:p>
+      <w:pPr>
+        <w:spacing w:after="160" w:line="300"/>
+        <w:jc w:val="both"/>
+      </w:pPr>
+      <w:r>
+        <w:rPr>
+          <w:color w:val="333333"/>
+          <w:sz w:val="22"/>
+          <w:szCs w:val="22"/>
+        </w:rPr>
+        <w:t xml:space="preserve">Implementation status at the time of submission: the CloudWatch alarm on failed revocations is deployed and has been tested with a deliberately simulated failure. CloudTrail cross-referencing and AWS Budgets spend alerts are designed into the architecture but not yet deployed in this environment. The DynamoDB table currently uses its default AWS-owned encryption key rather than a separate customer-managed KMS key, which is a lower-cost, equally-encrypted alternative suitable for a development-scale deployment.</w:t>
       </w:r>
     </w:p>
     <w:p>
@@ -1081,7 +1095,7 @@
           <w:sz w:val="22"/>
           <w:szCs w:val="22"/>
         </w:rPr>
-        <w:t xml:space="preserve">A complete, timestamped audit trail in DynamoDB that matches what CloudTrail independently recorded for the same grant and revocation.</w:t>
+        <w:t xml:space="preserve">A complete, timestamped audit trail in DynamoDB showing every stage of one grant's lifecycle: pending, active, and expired.</w:t>
       </w:r>
     </w:p>
     <w:p>

</xml_diff>

<commit_message>
Clarify CloudTrail/Budgets are covered by existing account-wide resources
</commit_message>
<xml_diff>
--- a/docs/JIT_Access_Manager_Proposal.docx
+++ b/docs/JIT_Access_Manager_Proposal.docx
@@ -993,7 +993,7 @@
           <w:sz w:val="22"/>
           <w:szCs w:val="22"/>
         </w:rPr>
-        <w:t xml:space="preserve">Implementation status at the time of submission: the CloudWatch alarm on failed revocations is deployed and has been tested with a deliberately simulated failure. CloudTrail cross-referencing and AWS Budgets spend alerts are designed into the architecture but not yet deployed in this environment. The DynamoDB table currently uses its default AWS-owned encryption key rather than a separate customer-managed KMS key, which is a lower-cost, equally-encrypted alternative suitable for a development-scale deployment.</w:t>
+        <w:t xml:space="preserve">Implementation status at the time of submission: the CloudWatch alarm on failed revocations is deployed and has been tested with a deliberately simulated failure. CloudTrail and AWS Budgets coverage is provided by an existing account-wide, multi-region trail and a monthly budget originally deployed for a separate project in the same AWS account; because both services operate at the account level rather than per-project, they already capture every IAM policy attachment and detachment this system makes, confirmed by directly querying CloudTrail for this project's PutRolePolicy and DeleteRolePolicy events. A dedicated trail and budget scoped only to this project were therefore judged unnecessary rather than left undone. The DynamoDB table uses its default AWS-owned encryption key rather than a separate customer-managed KMS key, which is a lower-cost, equally-encrypted alternative suitable for a development-scale deployment.</w:t>
       </w:r>
     </w:p>
     <w:p>
@@ -1095,7 +1095,7 @@
           <w:sz w:val="22"/>
           <w:szCs w:val="22"/>
         </w:rPr>
-        <w:t xml:space="preserve">A complete, timestamped audit trail in DynamoDB showing every stage of one grant's lifecycle: pending, active, and expired.</w:t>
+        <w:t xml:space="preserve">A complete, timestamped audit trail in DynamoDB showing every stage of one grant's lifecycle, matched by the same two events (PutRolePolicy and DeleteRolePolicy) independently visible in the account's CloudTrail history.</w:t>
       </w:r>
     </w:p>
     <w:p>

</xml_diff>